<commit_message>
Etapas de desarrollo y organigrama finalizado
</commit_message>
<xml_diff>
--- a/SILAIS - Auditoria/AVANCES_PROYECTO_FINAL/IX. TRABAJO DE AUDITORIA/ORGANIGRAMA.docx
+++ b/SILAIS - Auditoria/AVANCES_PROYECTO_FINAL/IX. TRABAJO DE AUDITORIA/ORGANIGRAMA.docx
@@ -1,6 +1,6 @@
 
 <file path=word/document.xml><?xml version="1.0" encoding="utf-8"?>
-<w:document xmlns:wpc="http://schemas.microsoft.com/office/word/2010/wordprocessingCanvas" xmlns:cx="http://schemas.microsoft.com/office/drawing/2014/chartex" xmlns:cx1="http://schemas.microsoft.com/office/drawing/2015/9/8/chartex" xmlns:cx2="http://schemas.microsoft.com/office/drawing/2015/10/21/chartex" xmlns:cx3="http://schemas.microsoft.com/office/drawing/2016/5/9/chartex" xmlns:cx4="http://schemas.microsoft.com/office/drawing/2016/5/10/chartex" xmlns:cx5="http://schemas.microsoft.com/office/drawing/2016/5/11/chartex" xmlns:cx6="http://schemas.microsoft.com/office/drawing/2016/5/12/chartex" xmlns:cx7="http://schemas.microsoft.com/office/drawing/2016/5/13/chartex" xmlns:cx8="http://schemas.microsoft.com/office/drawing/2016/5/14/chartex" xmlns:mc="http://schemas.openxmlformats.org/markup-compatibility/2006" xmlns:aink="http://schemas.microsoft.com/office/drawing/2016/ink" xmlns:am3d="http://schemas.microsoft.com/office/drawing/2017/model3d" xmlns:o="urn:schemas-microsoft-com:office:office" xmlns:r="http://schemas.openxmlformats.org/officeDocument/2006/relationships" xmlns:m="http://schemas.openxmlformats.org/officeDocument/2006/math" xmlns:v="urn:schemas-microsoft-com:vml" xmlns:wp14="http://schemas.microsoft.com/office/word/2010/wordprocessingDrawing" xmlns:wp="http://schemas.openxmlformats.org/drawingml/2006/wordprocessingDrawing" xmlns:w10="urn:schemas-microsoft-com:office:word" xmlns:w="http://schemas.openxmlformats.org/wordprocessingml/2006/main" xmlns:w14="http://schemas.microsoft.com/office/word/2010/wordml" xmlns:w15="http://schemas.microsoft.com/office/word/2012/wordml" xmlns:w16cex="http://schemas.microsoft.com/office/word/2018/wordml/cex" xmlns:w16cid="http://schemas.microsoft.com/office/word/2016/wordml/cid" xmlns:w16="http://schemas.microsoft.com/office/word/2018/wordml" xmlns:w16sdtdh="http://schemas.microsoft.com/office/word/2020/wordml/sdtdatahash" xmlns:w16se="http://schemas.microsoft.com/office/word/2015/wordml/symex" xmlns:wpg="http://schemas.microsoft.com/office/word/2010/wordprocessingGroup" xmlns:wpi="http://schemas.microsoft.com/office/word/2010/wordprocessingInk" xmlns:wne="http://schemas.microsoft.com/office/word/2006/wordml" xmlns:wps="http://schemas.microsoft.com/office/word/2010/wordprocessingShape" mc:Ignorable="w14 w15 w16se w16cid w16 w16cex w16sdtdh wp14">
+<w:document xmlns:wpc="http://schemas.microsoft.com/office/word/2010/wordprocessingCanvas" xmlns:cx="http://schemas.microsoft.com/office/drawing/2014/chartex" xmlns:cx1="http://schemas.microsoft.com/office/drawing/2015/9/8/chartex" xmlns:mc="http://schemas.openxmlformats.org/markup-compatibility/2006" xmlns:o="urn:schemas-microsoft-com:office:office" xmlns:r="http://schemas.openxmlformats.org/officeDocument/2006/relationships" xmlns:m="http://schemas.openxmlformats.org/officeDocument/2006/math" xmlns:v="urn:schemas-microsoft-com:vml" xmlns:wp14="http://schemas.microsoft.com/office/word/2010/wordprocessingDrawing" xmlns:wp="http://schemas.openxmlformats.org/drawingml/2006/wordprocessingDrawing" xmlns:w10="urn:schemas-microsoft-com:office:word" xmlns:w="http://schemas.openxmlformats.org/wordprocessingml/2006/main" xmlns:w14="http://schemas.microsoft.com/office/word/2010/wordml" xmlns:w15="http://schemas.microsoft.com/office/word/2012/wordml" xmlns:w16se="http://schemas.microsoft.com/office/word/2015/wordml/symex" xmlns:wpg="http://schemas.microsoft.com/office/word/2010/wordprocessingGroup" xmlns:wpi="http://schemas.microsoft.com/office/word/2010/wordprocessingInk" xmlns:wne="http://schemas.microsoft.com/office/word/2006/wordml" xmlns:wps="http://schemas.microsoft.com/office/word/2010/wordprocessingShape" mc:Ignorable="w14 w15 w16se wp14">
   <w:body>
     <w:p>
       <w:pPr>
@@ -16,6 +16,7 @@
           <w:b/>
           <w:bCs/>
           <w:noProof/>
+          <w:lang w:eastAsia="es-US"/>
         </w:rPr>
         <w:drawing>
           <wp:anchor distT="0" distB="0" distL="114300" distR="114300" simplePos="0" relativeHeight="251659264" behindDoc="1" locked="0" layoutInCell="1" allowOverlap="1" wp14:anchorId="7DD7427A" wp14:editId="461E4598">
@@ -257,7 +258,21 @@
         <w:rPr>
           <w:rFonts w:ascii="Arial" w:hAnsi="Arial" w:cs="Arial"/>
         </w:rPr>
-        <w:t xml:space="preserve">Es el responsable de evaluar la infraestructura física y la arquitectura lógica de la red del SILAIS - Sede Masaya. Sus funciones incluyen la inspección de las áreas de comunicaciones (Switch Principal </w:t>
+        <w:t>Es el responsable de evaluar la infraestructura física y la arquitectura lógica de la red del SILAIS - Sede Masaya. Sus funciones incluyen la inspección de las áreas de comunicaciones (</w:t>
+      </w:r>
+      <w:proofErr w:type="spellStart"/>
+      <w:r>
+        <w:rPr>
+          <w:rFonts w:ascii="Arial" w:hAnsi="Arial" w:cs="Arial"/>
+        </w:rPr>
+        <w:t>Switch</w:t>
+      </w:r>
+      <w:proofErr w:type="spellEnd"/>
+      <w:r>
+        <w:rPr>
+          <w:rFonts w:ascii="Arial" w:hAnsi="Arial" w:cs="Arial"/>
+        </w:rPr>
+        <w:t xml:space="preserve"> Principal </w:t>
       </w:r>
       <w:proofErr w:type="spellStart"/>
       <w:r>
@@ -271,7 +286,21 @@
         <w:rPr>
           <w:rFonts w:ascii="Arial" w:hAnsi="Arial" w:cs="Arial"/>
         </w:rPr>
-        <w:t xml:space="preserve"> Ethernet de 24 puertos en Dirección, Switch Secundario </w:t>
+        <w:t xml:space="preserve"> Ethernet de 24 puertos en Dirección, </w:t>
+      </w:r>
+      <w:proofErr w:type="spellStart"/>
+      <w:r>
+        <w:rPr>
+          <w:rFonts w:ascii="Arial" w:hAnsi="Arial" w:cs="Arial"/>
+        </w:rPr>
+        <w:t>Switch</w:t>
+      </w:r>
+      <w:proofErr w:type="spellEnd"/>
+      <w:r>
+        <w:rPr>
+          <w:rFonts w:ascii="Arial" w:hAnsi="Arial" w:cs="Arial"/>
+        </w:rPr>
+        <w:t xml:space="preserve"> Secundario </w:t>
       </w:r>
       <w:proofErr w:type="spellStart"/>
       <w:r>
@@ -453,7 +482,21 @@
         <w:rPr>
           <w:rFonts w:ascii="Arial" w:hAnsi="Arial" w:cs="Arial"/>
         </w:rPr>
-        <w:t xml:space="preserve">, la velocidad de negociación de enlace limitada a 100 Mbps por switches </w:t>
+        <w:t xml:space="preserve">, la velocidad de negociación de enlace limitada a 100 Mbps por </w:t>
+      </w:r>
+      <w:proofErr w:type="spellStart"/>
+      <w:r>
+        <w:rPr>
+          <w:rFonts w:ascii="Arial" w:hAnsi="Arial" w:cs="Arial"/>
+        </w:rPr>
+        <w:t>switches</w:t>
+      </w:r>
+      <w:proofErr w:type="spellEnd"/>
+      <w:r>
+        <w:rPr>
+          <w:rFonts w:ascii="Arial" w:hAnsi="Arial" w:cs="Arial"/>
+        </w:rPr>
+        <w:t xml:space="preserve"> </w:t>
       </w:r>
       <w:proofErr w:type="spellStart"/>
       <w:r>
@@ -481,7 +524,21 @@
         <w:rPr>
           <w:rFonts w:ascii="Arial" w:hAnsi="Arial" w:cs="Arial"/>
         </w:rPr>
-        <w:t xml:space="preserve">, nslookup, </w:t>
+        <w:t xml:space="preserve">, </w:t>
+      </w:r>
+      <w:proofErr w:type="spellStart"/>
+      <w:r>
+        <w:rPr>
+          <w:rFonts w:ascii="Arial" w:hAnsi="Arial" w:cs="Arial"/>
+        </w:rPr>
+        <w:t>nslookup</w:t>
+      </w:r>
+      <w:proofErr w:type="spellEnd"/>
+      <w:r>
+        <w:rPr>
+          <w:rFonts w:ascii="Arial" w:hAnsi="Arial" w:cs="Arial"/>
+        </w:rPr>
+        <w:t xml:space="preserve">, </w:t>
       </w:r>
       <w:proofErr w:type="spellStart"/>
       <w:r>
@@ -4006,10 +4063,10 @@
         <w:tblLook w:val="04A0" w:firstRow="1" w:lastRow="0" w:firstColumn="1" w:lastColumn="0" w:noHBand="0" w:noVBand="1"/>
       </w:tblPr>
       <w:tblGrid>
-        <w:gridCol w:w="514"/>
-        <w:gridCol w:w="3067"/>
-        <w:gridCol w:w="2470"/>
-        <w:gridCol w:w="2591"/>
+        <w:gridCol w:w="673"/>
+        <w:gridCol w:w="2944"/>
+        <w:gridCol w:w="2453"/>
+        <w:gridCol w:w="2572"/>
       </w:tblGrid>
       <w:tr>
         <w:tc>
@@ -4401,22 +4458,15 @@
               <w:rPr>
                 <w:rFonts w:ascii="Arial" w:hAnsi="Arial" w:cs="Arial"/>
               </w:rPr>
-              <w:t xml:space="preserve">Evaluar la infraestructura física de la red y el estado del hardware de cómputo del Instituto Ulises Tapia Roa, incluyendo la inspección del área de comunicaciones, la verificación del cableado estructurado (23 tendidos UTP Categoría 6), la realización de pruebas de continuidad con cable </w:t>
-            </w:r>
-            <w:proofErr w:type="spellStart"/>
-            <w:r>
-              <w:rPr>
-                <w:rFonts w:ascii="Arial" w:hAnsi="Arial" w:cs="Arial"/>
-              </w:rPr>
-              <w:t>tester</w:t>
-            </w:r>
-            <w:proofErr w:type="spellEnd"/>
-            <w:r>
-              <w:rPr>
-                <w:rFonts w:ascii="Arial" w:hAnsi="Arial" w:cs="Arial"/>
-              </w:rPr>
-              <w:t>, y la evaluación del estado de las 23 computadoras (21 del laboratorio y 2 de dirección). Documenta los hallazgos físicos y los reporta al Coordinador General de Auditoría.</w:t>
-            </w:r>
+              <w:t>Evaluar única y exclusivamente el estado de las computadoras del SILAIS - Sede Masaya. Sus funciones incluyen la evaluación de las 46 computadoras de escritorio y 5 laptops distribuidas en las 14 áreas funcionales, abarcando todos los componentes internos y externos de dichos equipos de cómputo: tarjeta madre, procesador, unidades de almacenamiento, dispositivos multimedia, soporte para gráficos, monitor, teclado, ratón, tarjetas adicionales, periféricos externos asociados, aprovechamiento y utilidad de los componentes, obsolescencia y durabilidad, garantía y soporte, y mantenimiento básico de los sistemas. No audita la infraestructura física de la red ni el hardware de red. Documenta los hallazgos de hardware de cómputo y los reporta al Coordinador General de Auditoría.</w:t>
+            </w:r>
+          </w:p>
+          <w:p>
+            <w:pPr>
+              <w:rPr>
+                <w:rFonts w:ascii="Arial" w:hAnsi="Arial" w:cs="Arial"/>
+              </w:rPr>
+            </w:pPr>
           </w:p>
         </w:tc>
       </w:tr>
@@ -4487,21 +4537,7 @@
               <w:rPr>
                 <w:rFonts w:ascii="Arial" w:hAnsi="Arial" w:cs="Arial"/>
               </w:rPr>
-              <w:t>Inspecciona el área de comunicaciones (</w:t>
-            </w:r>
-            <w:proofErr w:type="spellStart"/>
-            <w:r>
-              <w:rPr>
-                <w:rFonts w:ascii="Arial" w:hAnsi="Arial" w:cs="Arial"/>
-              </w:rPr>
-              <w:t>router</w:t>
-            </w:r>
-            <w:proofErr w:type="spellEnd"/>
-            <w:r>
-              <w:rPr>
-                <w:rFonts w:ascii="Arial" w:hAnsi="Arial" w:cs="Arial"/>
-              </w:rPr>
-              <w:t>, switch, UPS, escritorio de madera) verificando condiciones de seguridad física, orden y ventilación.</w:t>
+              <w:t>Evalúa la tarjeta madre de los 51 equipos de cómputo: fabricante, tipo, versión del BIOS, arquitectura, conjunto de chips, ranuras de expansión, capacidad máxima de RAM, puertos, bahías y conexiones periféricas.</w:t>
             </w:r>
           </w:p>
         </w:tc>
@@ -4544,7 +4580,7 @@
               <w:rPr>
                 <w:rFonts w:ascii="Arial" w:hAnsi="Arial" w:cs="Arial"/>
               </w:rPr>
-              <w:t>Verifica el cableado estructurado: 23 tendidos UTP Categoría 6, conectores RJ45, norma de ponchado T568B, canalización con grapas plásticas, etiquetado tipo banderín.</w:t>
+              <w:t>Evalúa el procesador: fabricante, marca, tipo, velocidad de procesamiento, memoria cache y características.</w:t>
             </w:r>
           </w:p>
         </w:tc>
@@ -4587,21 +4623,7 @@
               <w:rPr>
                 <w:rFonts w:ascii="Arial" w:hAnsi="Arial" w:cs="Arial"/>
               </w:rPr>
-              <w:t xml:space="preserve">Realiza pruebas de continuidad con cable </w:t>
-            </w:r>
-            <w:proofErr w:type="spellStart"/>
-            <w:r>
-              <w:rPr>
-                <w:rFonts w:ascii="Arial" w:hAnsi="Arial" w:cs="Arial"/>
-              </w:rPr>
-              <w:t>tester</w:t>
-            </w:r>
-            <w:proofErr w:type="spellEnd"/>
-            <w:r>
-              <w:rPr>
-                <w:rFonts w:ascii="Arial" w:hAnsi="Arial" w:cs="Arial"/>
-              </w:rPr>
-              <w:t xml:space="preserve"> a los 23 tendidos de cable.</w:t>
+              <w:t>Evalúa las unidades de almacenamiento: discos duros (fabricante, capacidad, características), unidades de CD-ROM, DVD, CD-R y unidades de cinta.</w:t>
             </w:r>
           </w:p>
         </w:tc>
@@ -4644,7 +4666,7 @@
               <w:rPr>
                 <w:rFonts w:ascii="Arial" w:hAnsi="Arial" w:cs="Arial"/>
               </w:rPr>
-              <w:t>Evalúa el estado de las 23 computadoras (21 del laboratorio y 2 de dirección), incluyendo discos duros (monitoreo S.M.A.R.T.), memoria RAM, fuentes de poder, ventilación, limpieza interna y periféricos.</w:t>
+              <w:t>Evalúa los dispositivos multimedia: sonido, tarjetas, bocinas, micrófono y video.</w:t>
             </w:r>
           </w:p>
         </w:tc>
@@ -4687,21 +4709,7 @@
               <w:rPr>
                 <w:rFonts w:ascii="Arial" w:hAnsi="Arial" w:cs="Arial"/>
               </w:rPr>
-              <w:t xml:space="preserve">Documenta los hallazgos físicos mediante registro fotográfico y </w:t>
-            </w:r>
-            <w:proofErr w:type="spellStart"/>
-            <w:r>
-              <w:rPr>
-                <w:rFonts w:ascii="Arial" w:hAnsi="Arial" w:cs="Arial"/>
-              </w:rPr>
-              <w:t>checklists</w:t>
-            </w:r>
-            <w:proofErr w:type="spellEnd"/>
-            <w:r>
-              <w:rPr>
-                <w:rFonts w:ascii="Arial" w:hAnsi="Arial" w:cs="Arial"/>
-              </w:rPr>
-              <w:t>.</w:t>
+              <w:t>Evalúa el soporte para gráficos: fabricante, capacidad en RAM e interfaz.</w:t>
             </w:r>
           </w:p>
         </w:tc>
@@ -4744,7 +4752,7 @@
               <w:rPr>
                 <w:rFonts w:ascii="Arial" w:hAnsi="Arial" w:cs="Arial"/>
               </w:rPr>
-              <w:t>Reporta los hallazgos físicos al Coordinador General de Auditoría para su consolidación.</w:t>
+              <w:t>Evalúa el monitor: fabricante, modelo, tamaño y características.</w:t>
             </w:r>
           </w:p>
         </w:tc>
@@ -4787,7 +4795,297 @@
               <w:rPr>
                 <w:rFonts w:ascii="Arial" w:hAnsi="Arial" w:cs="Arial"/>
               </w:rPr>
-              <w:t>Realiza actividades afines a las anteriores orientadas por su jefe inmediato relacionadas con el área.</w:t>
+              <w:t>Evalúa las tarjetas adicionales: aceleradora d</w:t>
+            </w:r>
+            <w:r>
+              <w:rPr>
+                <w:rFonts w:ascii="Arial" w:hAnsi="Arial" w:cs="Arial"/>
+              </w:rPr>
+              <w:t>e gráficos, de red, multimedia</w:t>
+            </w:r>
+            <w:r>
+              <w:rPr>
+                <w:rFonts w:ascii="Arial" w:hAnsi="Arial" w:cs="Arial"/>
+              </w:rPr>
+              <w:t>, video y otras tarjetas de extensión.</w:t>
+            </w:r>
+          </w:p>
+        </w:tc>
+      </w:tr>
+      <w:tr>
+        <w:tc>
+          <w:tcPr>
+            <w:tcW w:w="367" w:type="dxa"/>
+          </w:tcPr>
+          <w:p>
+            <w:pPr>
+              <w:rPr>
+                <w:rFonts w:ascii="Arial" w:hAnsi="Arial" w:cs="Arial"/>
+                <w:b/>
+                <w:bCs/>
+              </w:rPr>
+            </w:pPr>
+            <w:r>
+              <w:rPr>
+                <w:rFonts w:ascii="Arial" w:hAnsi="Arial" w:cs="Arial"/>
+                <w:b/>
+                <w:bCs/>
+              </w:rPr>
+              <w:t>8</w:t>
+            </w:r>
+          </w:p>
+        </w:tc>
+        <w:tc>
+          <w:tcPr>
+            <w:tcW w:w="8275" w:type="dxa"/>
+            <w:gridSpan w:val="3"/>
+          </w:tcPr>
+          <w:p>
+            <w:pPr>
+              <w:rPr>
+                <w:rFonts w:ascii="Arial" w:hAnsi="Arial" w:cs="Arial"/>
+              </w:rPr>
+            </w:pPr>
+            <w:r>
+              <w:rPr>
+                <w:rFonts w:ascii="Arial" w:hAnsi="Arial" w:cs="Arial"/>
+              </w:rPr>
+              <w:t>Evalúa los periféricos externos asociados: impresoras, sistemas</w:t>
+            </w:r>
+            <w:r>
+              <w:rPr>
+                <w:rFonts w:ascii="Arial" w:hAnsi="Arial" w:cs="Arial"/>
+              </w:rPr>
+              <w:t xml:space="preserve"> de videoconferencia, escáner.</w:t>
+            </w:r>
+          </w:p>
+        </w:tc>
+      </w:tr>
+      <w:tr>
+        <w:tc>
+          <w:tcPr>
+            <w:tcW w:w="367" w:type="dxa"/>
+          </w:tcPr>
+          <w:p>
+            <w:pPr>
+              <w:rPr>
+                <w:rFonts w:ascii="Arial" w:hAnsi="Arial" w:cs="Arial"/>
+                <w:b/>
+                <w:bCs/>
+              </w:rPr>
+            </w:pPr>
+            <w:r>
+              <w:rPr>
+                <w:rFonts w:ascii="Arial" w:hAnsi="Arial" w:cs="Arial"/>
+                <w:b/>
+                <w:bCs/>
+              </w:rPr>
+              <w:t>9</w:t>
+            </w:r>
+          </w:p>
+        </w:tc>
+        <w:tc>
+          <w:tcPr>
+            <w:tcW w:w="8275" w:type="dxa"/>
+            <w:gridSpan w:val="3"/>
+          </w:tcPr>
+          <w:p>
+            <w:pPr>
+              <w:rPr>
+                <w:rFonts w:ascii="Arial" w:hAnsi="Arial" w:cs="Arial"/>
+              </w:rPr>
+            </w:pPr>
+            <w:r>
+              <w:rPr>
+                <w:rFonts w:ascii="Arial" w:hAnsi="Arial" w:cs="Arial"/>
+              </w:rPr>
+              <w:t>Evalúa la capacidad de crecimiento, calidad de componentes, obsolescencia, durabilidad, garantía y soporte del fabricante.</w:t>
+            </w:r>
+          </w:p>
+        </w:tc>
+      </w:tr>
+      <w:tr>
+        <w:tc>
+          <w:tcPr>
+            <w:tcW w:w="367" w:type="dxa"/>
+          </w:tcPr>
+          <w:p>
+            <w:pPr>
+              <w:rPr>
+                <w:rFonts w:ascii="Arial" w:hAnsi="Arial" w:cs="Arial"/>
+                <w:b/>
+                <w:bCs/>
+              </w:rPr>
+            </w:pPr>
+            <w:r>
+              <w:rPr>
+                <w:rFonts w:ascii="Arial" w:hAnsi="Arial" w:cs="Arial"/>
+                <w:b/>
+                <w:bCs/>
+              </w:rPr>
+              <w:t>10</w:t>
+            </w:r>
+          </w:p>
+        </w:tc>
+        <w:tc>
+          <w:tcPr>
+            <w:tcW w:w="8275" w:type="dxa"/>
+            <w:gridSpan w:val="3"/>
+          </w:tcPr>
+          <w:p>
+            <w:pPr>
+              <w:rPr>
+                <w:rFonts w:ascii="Arial" w:hAnsi="Arial" w:cs="Arial"/>
+              </w:rPr>
+            </w:pPr>
+            <w:r>
+              <w:rPr>
+                <w:rFonts w:ascii="Arial" w:hAnsi="Arial" w:cs="Arial"/>
+              </w:rPr>
+              <w:t>Evalúa el teclado, ratón y joystick.</w:t>
+            </w:r>
+          </w:p>
+        </w:tc>
+      </w:tr>
+      <w:tr>
+        <w:tc>
+          <w:tcPr>
+            <w:tcW w:w="367" w:type="dxa"/>
+          </w:tcPr>
+          <w:p>
+            <w:pPr>
+              <w:rPr>
+                <w:rFonts w:ascii="Arial" w:hAnsi="Arial" w:cs="Arial"/>
+                <w:b/>
+                <w:bCs/>
+              </w:rPr>
+            </w:pPr>
+            <w:r>
+              <w:rPr>
+                <w:rFonts w:ascii="Arial" w:hAnsi="Arial" w:cs="Arial"/>
+                <w:b/>
+                <w:bCs/>
+              </w:rPr>
+              <w:t>11</w:t>
+            </w:r>
+          </w:p>
+        </w:tc>
+        <w:tc>
+          <w:tcPr>
+            <w:tcW w:w="8275" w:type="dxa"/>
+            <w:gridSpan w:val="3"/>
+          </w:tcPr>
+          <w:p>
+            <w:pPr>
+              <w:rPr>
+                <w:rFonts w:ascii="Arial" w:hAnsi="Arial" w:cs="Arial"/>
+              </w:rPr>
+            </w:pPr>
+            <w:r>
+              <w:rPr>
+                <w:rFonts w:ascii="Arial" w:hAnsi="Arial" w:cs="Arial"/>
+              </w:rPr>
+              <w:t>Evalúa el mantenimiento básico de los sistemas: preventivo y correctivo, sistemas reguladores de corriente, instalaciones eléctricas y protección ambiental contra humedad, polvo y estática.</w:t>
+            </w:r>
+          </w:p>
+        </w:tc>
+      </w:tr>
+      <w:tr>
+        <w:tc>
+          <w:tcPr>
+            <w:tcW w:w="367" w:type="dxa"/>
+          </w:tcPr>
+          <w:p>
+            <w:pPr>
+              <w:rPr>
+                <w:rFonts w:ascii="Arial" w:hAnsi="Arial" w:cs="Arial"/>
+                <w:b/>
+                <w:bCs/>
+              </w:rPr>
+            </w:pPr>
+            <w:r>
+              <w:rPr>
+                <w:rFonts w:ascii="Arial" w:hAnsi="Arial" w:cs="Arial"/>
+                <w:b/>
+                <w:bCs/>
+              </w:rPr>
+              <w:t>12</w:t>
+            </w:r>
+          </w:p>
+        </w:tc>
+        <w:tc>
+          <w:tcPr>
+            <w:tcW w:w="8275" w:type="dxa"/>
+            <w:gridSpan w:val="3"/>
+          </w:tcPr>
+          <w:p>
+            <w:pPr>
+              <w:rPr>
+                <w:rFonts w:ascii="Arial" w:hAnsi="Arial" w:cs="Arial"/>
+              </w:rPr>
+            </w:pPr>
+            <w:r>
+              <w:rPr>
+                <w:rFonts w:ascii="Arial" w:hAnsi="Arial" w:cs="Arial"/>
+              </w:rPr>
+              <w:t xml:space="preserve">Documenta los hallazgos de hardware de cómputo mediante registro fotográfico y </w:t>
+            </w:r>
+            <w:proofErr w:type="spellStart"/>
+            <w:r>
+              <w:rPr>
+                <w:rFonts w:ascii="Arial" w:hAnsi="Arial" w:cs="Arial"/>
+              </w:rPr>
+              <w:t>checklists</w:t>
+            </w:r>
+            <w:proofErr w:type="spellEnd"/>
+            <w:r>
+              <w:rPr>
+                <w:rFonts w:ascii="Arial" w:hAnsi="Arial" w:cs="Arial"/>
+              </w:rPr>
+              <w:t>.</w:t>
+            </w:r>
+          </w:p>
+        </w:tc>
+      </w:tr>
+      <w:tr>
+        <w:tc>
+          <w:tcPr>
+            <w:tcW w:w="367" w:type="dxa"/>
+          </w:tcPr>
+          <w:p>
+            <w:pPr>
+              <w:rPr>
+                <w:rFonts w:ascii="Arial" w:hAnsi="Arial" w:cs="Arial"/>
+                <w:b/>
+                <w:bCs/>
+              </w:rPr>
+            </w:pPr>
+            <w:r>
+              <w:rPr>
+                <w:rFonts w:ascii="Arial" w:hAnsi="Arial" w:cs="Arial"/>
+                <w:b/>
+                <w:bCs/>
+              </w:rPr>
+              <w:t xml:space="preserve">13 </w:t>
+            </w:r>
+          </w:p>
+        </w:tc>
+        <w:tc>
+          <w:tcPr>
+            <w:tcW w:w="8275" w:type="dxa"/>
+            <w:gridSpan w:val="3"/>
+          </w:tcPr>
+          <w:p>
+            <w:pPr>
+              <w:rPr>
+                <w:rFonts w:ascii="Arial" w:hAnsi="Arial" w:cs="Arial"/>
+              </w:rPr>
+            </w:pPr>
+            <w:r>
+              <w:rPr>
+                <w:rFonts w:ascii="Arial" w:hAnsi="Arial" w:cs="Arial"/>
+              </w:rPr>
+              <w:t>Reporta los hallazgos de hardware de cómputo al Coordinador General de Auditoría para su consolidación.</w:t>
             </w:r>
           </w:p>
         </w:tc>
@@ -4867,7 +5165,13 @@
               <w:rPr>
                 <w:rFonts w:ascii="Arial" w:hAnsi="Arial" w:cs="Arial"/>
               </w:rPr>
-              <w:t>Director del Instituto Ulises Tapia Roa</w:t>
+              <w:t>Director G</w:t>
+            </w:r>
+            <w:r>
+              <w:rPr>
+                <w:rFonts w:ascii="Arial" w:hAnsi="Arial" w:cs="Arial"/>
+              </w:rPr>
+              <w:t>eneral del SILAIS - Sede Masaya</w:t>
             </w:r>
           </w:p>
           <w:p>
@@ -4954,6 +5258,7 @@
                 <w:b/>
                 <w:bCs/>
               </w:rPr>
+              <w:lastRenderedPageBreak/>
               <w:t>Perfil del cargo</w:t>
             </w:r>
           </w:p>
@@ -5010,7 +5315,7 @@
               <w:rPr>
                 <w:rFonts w:ascii="Arial" w:hAnsi="Arial" w:cs="Arial"/>
               </w:rPr>
-              <w:t>Estándares de cableado estructurado (ANSI/TIA/EIA-568-C, -569-C, -606-B)</w:t>
+              <w:t>Diagnóstico de hardware de computadoras (tarjeta madre, procesador, discos duros, memoria RAM, fuentes de poder, tarjetas de expansión)</w:t>
             </w:r>
           </w:p>
           <w:p>
@@ -5027,22 +5332,7 @@
               <w:rPr>
                 <w:rFonts w:ascii="Arial" w:hAnsi="Arial" w:cs="Arial"/>
               </w:rPr>
-              <w:lastRenderedPageBreak/>
-              <w:t xml:space="preserve">Pruebas de continuidad con cable </w:t>
-            </w:r>
-            <w:proofErr w:type="spellStart"/>
-            <w:r>
-              <w:rPr>
-                <w:rFonts w:ascii="Arial" w:hAnsi="Arial" w:cs="Arial"/>
-              </w:rPr>
-              <w:t>tester</w:t>
-            </w:r>
-            <w:proofErr w:type="spellEnd"/>
-            <w:r>
-              <w:rPr>
-                <w:rFonts w:ascii="Arial" w:hAnsi="Arial" w:cs="Arial"/>
-              </w:rPr>
-              <w:t xml:space="preserve"> RJ45</w:t>
+              <w:t>Monitoreo S.M.A.R.T. para discos duros</w:t>
             </w:r>
           </w:p>
           <w:p>
@@ -5059,7 +5349,7 @@
               <w:rPr>
                 <w:rFonts w:ascii="Arial" w:hAnsi="Arial" w:cs="Arial"/>
               </w:rPr>
-              <w:t>Diagnóstico de hardware de computadoras (discos duros, S.M.A.R.T., memoria RAM, fuentes de poder, ventilación)</w:t>
+              <w:t>Evaluación de periféricos (monitores, teclados, ratones, impresoras)</w:t>
             </w:r>
           </w:p>
           <w:p>
@@ -5076,7 +5366,7 @@
               <w:rPr>
                 <w:rFonts w:ascii="Arial" w:hAnsi="Arial" w:cs="Arial"/>
               </w:rPr>
-              <w:t>Mantenimiento preventivo de equipos de cómputo</w:t>
+              <w:t>Mantenimiento preventivo y correctivo de equipos de cómputo</w:t>
             </w:r>
           </w:p>
           <w:p>
@@ -5139,7 +5429,6 @@
                 <w:b/>
                 <w:bCs/>
               </w:rPr>
-              <w:lastRenderedPageBreak/>
               <w:t>Formación básica</w:t>
             </w:r>
           </w:p>
@@ -5176,9 +5465,10 @@
           </w:p>
           <w:p>
             <w:pPr>
+              <w:pStyle w:val="Prrafodelista"/>
               <w:numPr>
                 <w:ilvl w:val="0"/>
-                <w:numId w:val="4"/>
+                <w:numId w:val="17"/>
               </w:numPr>
               <w:rPr>
                 <w:rFonts w:ascii="Arial" w:hAnsi="Arial" w:cs="Arial"/>
@@ -5188,14 +5478,15 @@
               <w:rPr>
                 <w:rFonts w:ascii="Arial" w:hAnsi="Arial" w:cs="Arial"/>
               </w:rPr>
-              <w:t>Técnico en Cableado Estructurado, Electricidad, Electrónica, Mantenimiento de Computadoras o carreras afines.</w:t>
-            </w:r>
-          </w:p>
-          <w:p>
-            <w:pPr>
+              <w:t xml:space="preserve">Técnico en Mantenimiento de Computadoras, Electrónica, Tecnologías de la Información o carreras afines. </w:t>
+            </w:r>
+          </w:p>
+          <w:p>
+            <w:pPr>
+              <w:pStyle w:val="Prrafodelista"/>
               <w:numPr>
                 <w:ilvl w:val="0"/>
-                <w:numId w:val="4"/>
+                <w:numId w:val="17"/>
               </w:numPr>
               <w:rPr>
                 <w:rFonts w:ascii="Arial" w:hAnsi="Arial" w:cs="Arial"/>
@@ -5205,15 +5496,8 @@
               <w:rPr>
                 <w:rFonts w:ascii="Arial" w:hAnsi="Arial" w:cs="Arial"/>
               </w:rPr>
-              <w:t>Certificaciones en cableado estructurado (deseable).</w:t>
-            </w:r>
-          </w:p>
-          <w:p>
-            <w:pPr>
-              <w:rPr>
-                <w:rFonts w:ascii="Arial" w:hAnsi="Arial" w:cs="Arial"/>
-              </w:rPr>
-            </w:pPr>
+              <w:t>Certificaciones en hardware (deseable).</w:t>
+            </w:r>
           </w:p>
         </w:tc>
       </w:tr>
@@ -5261,21 +5545,7 @@
               <w:rPr>
                 <w:rFonts w:ascii="Arial" w:hAnsi="Arial" w:cs="Arial"/>
               </w:rPr>
-              <w:t xml:space="preserve">Manejo de cable </w:t>
-            </w:r>
-            <w:proofErr w:type="spellStart"/>
-            <w:r>
-              <w:rPr>
-                <w:rFonts w:ascii="Arial" w:hAnsi="Arial" w:cs="Arial"/>
-              </w:rPr>
-              <w:t>tester</w:t>
-            </w:r>
-            <w:proofErr w:type="spellEnd"/>
-            <w:r>
-              <w:rPr>
-                <w:rFonts w:ascii="Arial" w:hAnsi="Arial" w:cs="Arial"/>
-              </w:rPr>
-              <w:t xml:space="preserve"> RJ45</w:t>
+              <w:t>Desarme y limpieza de equipos de cómputo</w:t>
             </w:r>
           </w:p>
           <w:p>
@@ -5292,7 +5562,21 @@
               <w:rPr>
                 <w:rFonts w:ascii="Arial" w:hAnsi="Arial" w:cs="Arial"/>
               </w:rPr>
-              <w:t>Inspección visual y documentación fotográfica</w:t>
+              <w:t xml:space="preserve">Diagnóstico de discos duros (software S.M.A.R.T.: </w:t>
+            </w:r>
+            <w:proofErr w:type="spellStart"/>
+            <w:r>
+              <w:rPr>
+                <w:rFonts w:ascii="Arial" w:hAnsi="Arial" w:cs="Arial"/>
+              </w:rPr>
+              <w:t>CrystalDiskInfo</w:t>
+            </w:r>
+            <w:proofErr w:type="spellEnd"/>
+            <w:r>
+              <w:rPr>
+                <w:rFonts w:ascii="Arial" w:hAnsi="Arial" w:cs="Arial"/>
+              </w:rPr>
+              <w:t>)</w:t>
             </w:r>
           </w:p>
           <w:p>
@@ -5309,7 +5593,21 @@
               <w:rPr>
                 <w:rFonts w:ascii="Arial" w:hAnsi="Arial" w:cs="Arial"/>
               </w:rPr>
-              <w:t>Diagnóstico de discos duros (software S.M.A.R.T.)</w:t>
+              <w:t>Monitoreo de temperaturas (</w:t>
+            </w:r>
+            <w:proofErr w:type="spellStart"/>
+            <w:r>
+              <w:rPr>
+                <w:rFonts w:ascii="Arial" w:hAnsi="Arial" w:cs="Arial"/>
+              </w:rPr>
+              <w:t>HWMonitor</w:t>
+            </w:r>
+            <w:proofErr w:type="spellEnd"/>
+            <w:r>
+              <w:rPr>
+                <w:rFonts w:ascii="Arial" w:hAnsi="Arial" w:cs="Arial"/>
+              </w:rPr>
+              <w:t>)</w:t>
             </w:r>
           </w:p>
           <w:p>
@@ -5326,7 +5624,7 @@
               <w:rPr>
                 <w:rFonts w:ascii="Arial" w:hAnsi="Arial" w:cs="Arial"/>
               </w:rPr>
-              <w:t>Desarme y limpieza de equipos de cómputo</w:t>
+              <w:t>Inspección visual y documentación fotográfica</w:t>
             </w:r>
           </w:p>
           <w:p>
@@ -5494,6 +5792,7 @@
                 <w:b/>
                 <w:bCs/>
               </w:rPr>
+              <w:lastRenderedPageBreak/>
               <w:t>Experiencia</w:t>
             </w:r>
           </w:p>
@@ -5547,7 +5846,7 @@
               <w:rPr>
                 <w:rFonts w:ascii="Arial" w:hAnsi="Arial" w:cs="Arial"/>
               </w:rPr>
-              <w:t>Mínimo 1 año de experiencia en cableado estructurado, mantenimiento de computadoras o diagnóstico de hardware.</w:t>
+              <w:t>Mínimo 1 año de experiencia en mantenimiento de computadoras, diagnóstico de hardware o soporte técnico.</w:t>
             </w:r>
           </w:p>
         </w:tc>
@@ -5597,7 +5896,7 @@
               <w:rPr>
                 <w:rFonts w:ascii="Arial" w:hAnsi="Arial" w:cs="Arial"/>
               </w:rPr>
-              <w:t>Disponibilidad para trabajo de campo en el municipio de Nindirí, Masaya.</w:t>
+              <w:t>Disponibilidad para trabajo de campo en la ciudad de Masaya.</w:t>
             </w:r>
           </w:p>
           <w:p>
@@ -5669,7 +5968,6 @@
           <w:b/>
           <w:bCs/>
         </w:rPr>
-        <w:lastRenderedPageBreak/>
         <w:t xml:space="preserve">Auditor de </w:t>
       </w:r>
       <w:r>
@@ -6089,13 +6387,27 @@
               <w:rPr>
                 <w:rFonts w:ascii="Arial" w:hAnsi="Arial" w:cs="Arial"/>
               </w:rPr>
-              <w:t xml:space="preserve">Evaluar la infraestructura física y la arquitectura lógica de la red del SILAIS - Sede Masaya, incluyendo la inspección de las áreas de comunicaciones (Switch Principal </w:t>
+              <w:t>Evaluar la infraestructura física y la arquitectura lógica de la red del SILAIS - Sede Masaya, incluyendo la inspección de las áreas de comunicaciones (</w:t>
             </w:r>
             <w:proofErr w:type="spellStart"/>
             <w:r>
               <w:rPr>
                 <w:rFonts w:ascii="Arial" w:hAnsi="Arial" w:cs="Arial"/>
               </w:rPr>
+              <w:t>Switch</w:t>
+            </w:r>
+            <w:proofErr w:type="spellEnd"/>
+            <w:r>
+              <w:rPr>
+                <w:rFonts w:ascii="Arial" w:hAnsi="Arial" w:cs="Arial"/>
+              </w:rPr>
+              <w:t xml:space="preserve"> Principal </w:t>
+            </w:r>
+            <w:proofErr w:type="spellStart"/>
+            <w:r>
+              <w:rPr>
+                <w:rFonts w:ascii="Arial" w:hAnsi="Arial" w:cs="Arial"/>
+              </w:rPr>
               <w:t>Fast</w:t>
             </w:r>
             <w:proofErr w:type="spellEnd"/>
@@ -6103,13 +6415,27 @@
               <w:rPr>
                 <w:rFonts w:ascii="Arial" w:hAnsi="Arial" w:cs="Arial"/>
               </w:rPr>
-              <w:t xml:space="preserve"> Ethernet de 24 puertos en Dirección, Switch Secundario </w:t>
+              <w:t xml:space="preserve"> Ethernet de 24 puertos en Dirección, </w:t>
             </w:r>
             <w:proofErr w:type="spellStart"/>
             <w:r>
               <w:rPr>
                 <w:rFonts w:ascii="Arial" w:hAnsi="Arial" w:cs="Arial"/>
               </w:rPr>
+              <w:t>Switch</w:t>
+            </w:r>
+            <w:proofErr w:type="spellEnd"/>
+            <w:r>
+              <w:rPr>
+                <w:rFonts w:ascii="Arial" w:hAnsi="Arial" w:cs="Arial"/>
+              </w:rPr>
+              <w:t xml:space="preserve"> Secundario </w:t>
+            </w:r>
+            <w:proofErr w:type="spellStart"/>
+            <w:r>
+              <w:rPr>
+                <w:rFonts w:ascii="Arial" w:hAnsi="Arial" w:cs="Arial"/>
+              </w:rPr>
               <w:t>Fast</w:t>
             </w:r>
             <w:proofErr w:type="spellEnd"/>
@@ -6187,7 +6513,14 @@
               <w:rPr>
                 <w:rFonts w:ascii="Arial" w:hAnsi="Arial" w:cs="Arial"/>
               </w:rPr>
-              <w:t xml:space="preserve"> en puntos de red de áreas críticas, la verificación del esquema de direccionamiento IP, la configuración DHCP, la topología de red plana sin segmentación VLAN, la conectividad inalámbrica en áreas críticas, la verificación de protocolos de seguridad </w:t>
+              <w:t xml:space="preserve"> en puntos de red de áreas críticas, la verificación del esquema de direccionamiento IP, la configuración DHCP, la topología de red plana sin segmentación VLAN, la conectividad inalámbrica en áreas </w:t>
+            </w:r>
+            <w:r>
+              <w:rPr>
+                <w:rFonts w:ascii="Arial" w:hAnsi="Arial" w:cs="Arial"/>
+              </w:rPr>
+              <w:lastRenderedPageBreak/>
+              <w:t xml:space="preserve">críticas, la verificación de protocolos de seguridad </w:t>
             </w:r>
             <w:proofErr w:type="spellStart"/>
             <w:r>
@@ -6227,6 +6560,7 @@
                 <w:b/>
                 <w:bCs/>
               </w:rPr>
+              <w:lastRenderedPageBreak/>
               <w:t>FUNCIONES</w:t>
             </w:r>
           </w:p>
@@ -6396,7 +6730,6 @@
                 <w:b/>
                 <w:bCs/>
               </w:rPr>
-              <w:lastRenderedPageBreak/>
               <w:t>3</w:t>
             </w:r>
           </w:p>
@@ -6587,7 +6920,21 @@
               <w:rPr>
                 <w:rFonts w:ascii="Arial" w:hAnsi="Arial" w:cs="Arial"/>
               </w:rPr>
-              <w:t xml:space="preserve">Verifica la velocidad de negociación de enlace, confirmando operación a 100 Mbps por limitación de switches </w:t>
+              <w:t xml:space="preserve">Verifica la velocidad de negociación de enlace, confirmando operación a 100 Mbps por limitación de </w:t>
+            </w:r>
+            <w:proofErr w:type="spellStart"/>
+            <w:r>
+              <w:rPr>
+                <w:rFonts w:ascii="Arial" w:hAnsi="Arial" w:cs="Arial"/>
+              </w:rPr>
+              <w:t>switches</w:t>
+            </w:r>
+            <w:proofErr w:type="spellEnd"/>
+            <w:r>
+              <w:rPr>
+                <w:rFonts w:ascii="Arial" w:hAnsi="Arial" w:cs="Arial"/>
+              </w:rPr>
+              <w:t xml:space="preserve"> </w:t>
             </w:r>
             <w:proofErr w:type="spellStart"/>
             <w:r>
@@ -7011,6 +7358,7 @@
                 <w:b/>
                 <w:bCs/>
               </w:rPr>
+              <w:lastRenderedPageBreak/>
               <w:t>Perfil del cargo</w:t>
             </w:r>
           </w:p>
@@ -7257,7 +7605,39 @@
                 <w:rFonts w:ascii="Arial" w:hAnsi="Arial" w:cs="Arial"/>
                 <w:lang w:val="en-US"/>
               </w:rPr>
-              <w:t>, tracert, netstat)</w:t>
+              <w:t xml:space="preserve">, </w:t>
+            </w:r>
+            <w:proofErr w:type="spellStart"/>
+            <w:r>
+              <w:rPr>
+                <w:rFonts w:ascii="Arial" w:hAnsi="Arial" w:cs="Arial"/>
+                <w:lang w:val="en-US"/>
+              </w:rPr>
+              <w:t>tracert</w:t>
+            </w:r>
+            <w:proofErr w:type="spellEnd"/>
+            <w:r>
+              <w:rPr>
+                <w:rFonts w:ascii="Arial" w:hAnsi="Arial" w:cs="Arial"/>
+                <w:lang w:val="en-US"/>
+              </w:rPr>
+              <w:t xml:space="preserve">, </w:t>
+            </w:r>
+            <w:proofErr w:type="spellStart"/>
+            <w:r>
+              <w:rPr>
+                <w:rFonts w:ascii="Arial" w:hAnsi="Arial" w:cs="Arial"/>
+                <w:lang w:val="en-US"/>
+              </w:rPr>
+              <w:t>netstat</w:t>
+            </w:r>
+            <w:proofErr w:type="spellEnd"/>
+            <w:r>
+              <w:rPr>
+                <w:rFonts w:ascii="Arial" w:hAnsi="Arial" w:cs="Arial"/>
+                <w:lang w:val="en-US"/>
+              </w:rPr>
+              <w:t>)</w:t>
             </w:r>
           </w:p>
           <w:p>
@@ -7290,7 +7670,6 @@
                 <w:b/>
                 <w:bCs/>
               </w:rPr>
-              <w:lastRenderedPageBreak/>
               <w:t>Formación básica</w:t>
             </w:r>
           </w:p>
@@ -7830,6 +8209,7 @@
               <w:rPr>
                 <w:rFonts w:ascii="Arial" w:hAnsi="Arial" w:cs="Arial"/>
               </w:rPr>
+              <w:lastRenderedPageBreak/>
               <w:t>Mínimo 1 año de experiencia en administración de redes, configuración de DHCP/DNS, o soporte de infraestructura de red.</w:t>
             </w:r>
           </w:p>
@@ -7855,6 +8235,7 @@
                 <w:b/>
                 <w:bCs/>
               </w:rPr>
+              <w:lastRenderedPageBreak/>
               <w:t>Otros requisitos</w:t>
             </w:r>
           </w:p>
@@ -7961,7 +8342,6 @@
           <w:b/>
           <w:bCs/>
         </w:rPr>
-        <w:lastRenderedPageBreak/>
         <w:t xml:space="preserve">Auditor </w:t>
       </w:r>
       <w:r>
@@ -8374,7 +8754,7 @@
               <w:rPr>
                 <w:rFonts w:ascii="Arial" w:hAnsi="Arial" w:cs="Arial"/>
               </w:rPr>
-              <w:t xml:space="preserve">Apoyar las tareas operativas y documentales de la auditoría, incluyendo el registro fotográfico indexado de los hallazgos, el llenado de </w:t>
+              <w:t xml:space="preserve">Apoyar las tareas operativas y documentales de la auditoría, incluyendo el registro fotográfico indexado de los hallazgos en las 14 áreas funcionales del SILAIS, el llenado de </w:t>
             </w:r>
             <w:proofErr w:type="spellStart"/>
             <w:r>
@@ -8388,7 +8768,7 @@
               <w:rPr>
                 <w:rFonts w:ascii="Arial" w:hAnsi="Arial" w:cs="Arial"/>
               </w:rPr>
-              <w:t xml:space="preserve"> (Módulos I a V), el respaldo y organización de evidencias digitales, la redacción de borradores de informes, la preparación de presentaciones, y la gestión de anexos y formatos. Asiste a los auditores de hardware y redes durante el trabajo de campo, asegurando que toda la evidencia quede debidamente registrada y custodiada. Colabora en la consolidación de datos para la elaboración del informe preliminar y final.</w:t>
+              <w:t xml:space="preserve"> de red y de hardware, el respaldo y organización de evidencias digitales (fotografías, capturas de pantalla, resultados de pruebas de red y diagnóstico de hardware), la redacción de borradores de informes, la preparación de presentaciones, y la gestión de anexos y formatos. Asiste a los auditores de redes y hardware durante el trabajo de campo, asegurando que toda la evidencia quede debidamente registrada y custodiada. Colabora en la consolidación de datos para la elaboración del informe preliminar y final.</w:t>
             </w:r>
           </w:p>
         </w:tc>
@@ -8460,7 +8840,7 @@
               <w:rPr>
                 <w:rFonts w:ascii="Arial" w:hAnsi="Arial" w:cs="Arial"/>
               </w:rPr>
-              <w:t>Realiza el registro fotográfico indexado de los hallazgos durante el trabajo de campo.</w:t>
+              <w:t>Realiza el registro fotográfico indexado de los hallazgos durante el trabajo de campo en las 14 áreas funcionales.</w:t>
             </w:r>
           </w:p>
         </w:tc>
@@ -8484,6 +8864,7 @@
                 <w:b/>
                 <w:bCs/>
               </w:rPr>
+              <w:lastRenderedPageBreak/>
               <w:t>2</w:t>
             </w:r>
           </w:p>
@@ -8517,7 +8898,7 @@
               <w:rPr>
                 <w:rFonts w:ascii="Arial" w:hAnsi="Arial" w:cs="Arial"/>
               </w:rPr>
-              <w:t xml:space="preserve"> de auditoría (Módulos I a V) durante las inspecciones.</w:t>
+              <w:t xml:space="preserve"> de auditoría de red y de hardware durante las inspecciones físicas y pruebas lógicas.</w:t>
             </w:r>
           </w:p>
         </w:tc>
@@ -8560,7 +8941,7 @@
               <w:rPr>
                 <w:rFonts w:ascii="Arial" w:hAnsi="Arial" w:cs="Arial"/>
               </w:rPr>
-              <w:t>Respalda y organiza todas las evidencias digitales (fotografías, capturas de pantalla, resultados de pruebas).</w:t>
+              <w:t>Respalda y organiza todas las evidencias digitales (fotografías, capturas de pantalla, resultados de pruebas de red y hardware).</w:t>
             </w:r>
           </w:p>
         </w:tc>
@@ -8812,7 +9193,6 @@
               <w:rPr>
                 <w:rFonts w:ascii="Arial" w:hAnsi="Arial" w:cs="Arial"/>
               </w:rPr>
-              <w:lastRenderedPageBreak/>
               <w:t>Auditor de Hardware/Equipo</w:t>
             </w:r>
           </w:p>
@@ -8900,7 +9280,6 @@
                 <w:b/>
                 <w:bCs/>
               </w:rPr>
-              <w:lastRenderedPageBreak/>
               <w:t>Perfil del cargo</w:t>
             </w:r>
           </w:p>
@@ -9203,6 +9582,7 @@
               <w:rPr>
                 <w:rFonts w:ascii="Arial" w:hAnsi="Arial" w:cs="Arial"/>
               </w:rPr>
+              <w:lastRenderedPageBreak/>
               <w:t xml:space="preserve">Llenado de </w:t>
             </w:r>
             <w:proofErr w:type="spellStart"/>
@@ -9301,6 +9681,7 @@
                 <w:b/>
                 <w:bCs/>
               </w:rPr>
+              <w:lastRenderedPageBreak/>
               <w:t>Conocimientos deseables</w:t>
             </w:r>
           </w:p>
@@ -9444,7 +9825,6 @@
               <w:rPr>
                 <w:rFonts w:ascii="Arial" w:hAnsi="Arial" w:cs="Arial"/>
               </w:rPr>
-              <w:lastRenderedPageBreak/>
               <w:t>Mínimo 6 meses de experiencia en labores documentales, registro fotográfico, o asistencia en proyectos técnicos.</w:t>
             </w:r>
           </w:p>
@@ -9470,7 +9850,6 @@
                 <w:b/>
                 <w:bCs/>
               </w:rPr>
-              <w:lastRenderedPageBreak/>
               <w:t>Otros requisitos</w:t>
             </w:r>
           </w:p>
@@ -9496,7 +9875,7 @@
               <w:rPr>
                 <w:rFonts w:ascii="Arial" w:hAnsi="Arial" w:cs="Arial"/>
               </w:rPr>
-              <w:t>Disponibilidad para trabajo de campo en el municipio de Nindirí, Masaya.</w:t>
+              <w:t>Disponibilidad para trabajo de campo en la ciudad de Masaya.</w:t>
             </w:r>
           </w:p>
           <w:p>
@@ -9510,6 +9889,8 @@
                 <w:rFonts w:ascii="Arial" w:hAnsi="Arial" w:cs="Arial"/>
               </w:rPr>
             </w:pPr>
+            <w:bookmarkStart w:id="0" w:name="_GoBack"/>
+            <w:bookmarkEnd w:id="0"/>
             <w:r>
               <w:rPr>
                 <w:rFonts w:ascii="Arial" w:hAnsi="Arial" w:cs="Arial"/>
@@ -9557,7 +9938,7 @@
 </file>
 
 <file path=word/numbering.xml><?xml version="1.0" encoding="utf-8"?>
-<w:numbering xmlns:wpc="http://schemas.microsoft.com/office/word/2010/wordprocessingCanvas" xmlns:cx="http://schemas.microsoft.com/office/drawing/2014/chartex" xmlns:cx1="http://schemas.microsoft.com/office/drawing/2015/9/8/chartex" xmlns:cx2="http://schemas.microsoft.com/office/drawing/2015/10/21/chartex" xmlns:cx3="http://schemas.microsoft.com/office/drawing/2016/5/9/chartex" xmlns:cx4="http://schemas.microsoft.com/office/drawing/2016/5/10/chartex" xmlns:cx5="http://schemas.microsoft.com/office/drawing/2016/5/11/chartex" xmlns:cx6="http://schemas.microsoft.com/office/drawing/2016/5/12/chartex" xmlns:cx7="http://schemas.microsoft.com/office/drawing/2016/5/13/chartex" xmlns:cx8="http://schemas.microsoft.com/office/drawing/2016/5/14/chartex" xmlns:mc="http://schemas.openxmlformats.org/markup-compatibility/2006" xmlns:aink="http://schemas.microsoft.com/office/drawing/2016/ink" xmlns:am3d="http://schemas.microsoft.com/office/drawing/2017/model3d" xmlns:o="urn:schemas-microsoft-com:office:office" xmlns:r="http://schemas.openxmlformats.org/officeDocument/2006/relationships" xmlns:m="http://schemas.openxmlformats.org/officeDocument/2006/math" xmlns:v="urn:schemas-microsoft-com:vml" xmlns:wp14="http://schemas.microsoft.com/office/word/2010/wordprocessingDrawing" xmlns:wp="http://schemas.openxmlformats.org/drawingml/2006/wordprocessingDrawing" xmlns:w10="urn:schemas-microsoft-com:office:word" xmlns:w="http://schemas.openxmlformats.org/wordprocessingml/2006/main" xmlns:w14="http://schemas.microsoft.com/office/word/2010/wordml" xmlns:w15="http://schemas.microsoft.com/office/word/2012/wordml" xmlns:w16cex="http://schemas.microsoft.com/office/word/2018/wordml/cex" xmlns:w16cid="http://schemas.microsoft.com/office/word/2016/wordml/cid" xmlns:w16="http://schemas.microsoft.com/office/word/2018/wordml" xmlns:w16sdtdh="http://schemas.microsoft.com/office/word/2020/wordml/sdtdatahash" xmlns:w16se="http://schemas.microsoft.com/office/word/2015/wordml/symex" xmlns:wpg="http://schemas.microsoft.com/office/word/2010/wordprocessingGroup" xmlns:wpi="http://schemas.microsoft.com/office/word/2010/wordprocessingInk" xmlns:wne="http://schemas.microsoft.com/office/word/2006/wordml" xmlns:wps="http://schemas.microsoft.com/office/word/2010/wordprocessingShape" mc:Ignorable="w14 w15 w16se w16cid w16 w16cex w16sdtdh wp14">
+<w:numbering xmlns:wpc="http://schemas.microsoft.com/office/word/2010/wordprocessingCanvas" xmlns:cx="http://schemas.microsoft.com/office/drawing/2014/chartex" xmlns:cx1="http://schemas.microsoft.com/office/drawing/2015/9/8/chartex" xmlns:mc="http://schemas.openxmlformats.org/markup-compatibility/2006" xmlns:o="urn:schemas-microsoft-com:office:office" xmlns:r="http://schemas.openxmlformats.org/officeDocument/2006/relationships" xmlns:m="http://schemas.openxmlformats.org/officeDocument/2006/math" xmlns:v="urn:schemas-microsoft-com:vml" xmlns:wp14="http://schemas.microsoft.com/office/word/2010/wordprocessingDrawing" xmlns:wp="http://schemas.openxmlformats.org/drawingml/2006/wordprocessingDrawing" xmlns:w10="urn:schemas-microsoft-com:office:word" xmlns:w="http://schemas.openxmlformats.org/wordprocessingml/2006/main" xmlns:w14="http://schemas.microsoft.com/office/word/2010/wordml" xmlns:w15="http://schemas.microsoft.com/office/word/2012/wordml" xmlns:w16se="http://schemas.microsoft.com/office/word/2015/wordml/symex" xmlns:wpg="http://schemas.microsoft.com/office/word/2010/wordprocessingGroup" xmlns:wpi="http://schemas.microsoft.com/office/word/2010/wordprocessingInk" xmlns:wne="http://schemas.microsoft.com/office/word/2006/wordml" xmlns:wps="http://schemas.microsoft.com/office/word/2010/wordprocessingShape" mc:Ignorable="w14 w15 w16se wp14">
   <w:abstractNum w:abstractNumId="0" w15:restartNumberingAfterBreak="0">
     <w:nsid w:val="1C755D0A"/>
     <w:multiLevelType w:val="multilevel"/>
@@ -9708,6 +10089,155 @@
     </w:lvl>
   </w:abstractNum>
   <w:abstractNum w:abstractNumId="1" w15:restartNumberingAfterBreak="0">
+    <w:nsid w:val="1FA1299E"/>
+    <w:multiLevelType w:val="multilevel"/>
+    <w:tmpl w:val="90D0EB18"/>
+    <w:lvl w:ilvl="0">
+      <w:start w:val="1"/>
+      <w:numFmt w:val="bullet"/>
+      <w:lvlText w:val=""/>
+      <w:lvlJc w:val="left"/>
+      <w:pPr>
+        <w:tabs>
+          <w:tab w:val="num" w:pos="720"/>
+        </w:tabs>
+        <w:ind w:left="720" w:hanging="360"/>
+      </w:pPr>
+      <w:rPr>
+        <w:rFonts w:ascii="Symbol" w:hAnsi="Symbol" w:hint="default"/>
+        <w:sz w:val="20"/>
+      </w:rPr>
+    </w:lvl>
+    <w:lvl w:ilvl="1" w:tentative="1">
+      <w:start w:val="1"/>
+      <w:numFmt w:val="bullet"/>
+      <w:lvlText w:val="o"/>
+      <w:lvlJc w:val="left"/>
+      <w:pPr>
+        <w:tabs>
+          <w:tab w:val="num" w:pos="1440"/>
+        </w:tabs>
+        <w:ind w:left="1440" w:hanging="360"/>
+      </w:pPr>
+      <w:rPr>
+        <w:rFonts w:ascii="Courier New" w:hAnsi="Courier New" w:hint="default"/>
+        <w:sz w:val="20"/>
+      </w:rPr>
+    </w:lvl>
+    <w:lvl w:ilvl="2" w:tentative="1">
+      <w:start w:val="1"/>
+      <w:numFmt w:val="bullet"/>
+      <w:lvlText w:val=""/>
+      <w:lvlJc w:val="left"/>
+      <w:pPr>
+        <w:tabs>
+          <w:tab w:val="num" w:pos="2160"/>
+        </w:tabs>
+        <w:ind w:left="2160" w:hanging="360"/>
+      </w:pPr>
+      <w:rPr>
+        <w:rFonts w:ascii="Wingdings" w:hAnsi="Wingdings" w:hint="default"/>
+        <w:sz w:val="20"/>
+      </w:rPr>
+    </w:lvl>
+    <w:lvl w:ilvl="3" w:tentative="1">
+      <w:start w:val="1"/>
+      <w:numFmt w:val="bullet"/>
+      <w:lvlText w:val=""/>
+      <w:lvlJc w:val="left"/>
+      <w:pPr>
+        <w:tabs>
+          <w:tab w:val="num" w:pos="2880"/>
+        </w:tabs>
+        <w:ind w:left="2880" w:hanging="360"/>
+      </w:pPr>
+      <w:rPr>
+        <w:rFonts w:ascii="Wingdings" w:hAnsi="Wingdings" w:hint="default"/>
+        <w:sz w:val="20"/>
+      </w:rPr>
+    </w:lvl>
+    <w:lvl w:ilvl="4" w:tentative="1">
+      <w:start w:val="1"/>
+      <w:numFmt w:val="bullet"/>
+      <w:lvlText w:val=""/>
+      <w:lvlJc w:val="left"/>
+      <w:pPr>
+        <w:tabs>
+          <w:tab w:val="num" w:pos="3600"/>
+        </w:tabs>
+        <w:ind w:left="3600" w:hanging="360"/>
+      </w:pPr>
+      <w:rPr>
+        <w:rFonts w:ascii="Wingdings" w:hAnsi="Wingdings" w:hint="default"/>
+        <w:sz w:val="20"/>
+      </w:rPr>
+    </w:lvl>
+    <w:lvl w:ilvl="5" w:tentative="1">
+      <w:start w:val="1"/>
+      <w:numFmt w:val="bullet"/>
+      <w:lvlText w:val=""/>
+      <w:lvlJc w:val="left"/>
+      <w:pPr>
+        <w:tabs>
+          <w:tab w:val="num" w:pos="4320"/>
+        </w:tabs>
+        <w:ind w:left="4320" w:hanging="360"/>
+      </w:pPr>
+      <w:rPr>
+        <w:rFonts w:ascii="Wingdings" w:hAnsi="Wingdings" w:hint="default"/>
+        <w:sz w:val="20"/>
+      </w:rPr>
+    </w:lvl>
+    <w:lvl w:ilvl="6" w:tentative="1">
+      <w:start w:val="1"/>
+      <w:numFmt w:val="bullet"/>
+      <w:lvlText w:val=""/>
+      <w:lvlJc w:val="left"/>
+      <w:pPr>
+        <w:tabs>
+          <w:tab w:val="num" w:pos="5040"/>
+        </w:tabs>
+        <w:ind w:left="5040" w:hanging="360"/>
+      </w:pPr>
+      <w:rPr>
+        <w:rFonts w:ascii="Wingdings" w:hAnsi="Wingdings" w:hint="default"/>
+        <w:sz w:val="20"/>
+      </w:rPr>
+    </w:lvl>
+    <w:lvl w:ilvl="7" w:tentative="1">
+      <w:start w:val="1"/>
+      <w:numFmt w:val="bullet"/>
+      <w:lvlText w:val=""/>
+      <w:lvlJc w:val="left"/>
+      <w:pPr>
+        <w:tabs>
+          <w:tab w:val="num" w:pos="5760"/>
+        </w:tabs>
+        <w:ind w:left="5760" w:hanging="360"/>
+      </w:pPr>
+      <w:rPr>
+        <w:rFonts w:ascii="Wingdings" w:hAnsi="Wingdings" w:hint="default"/>
+        <w:sz w:val="20"/>
+      </w:rPr>
+    </w:lvl>
+    <w:lvl w:ilvl="8" w:tentative="1">
+      <w:start w:val="1"/>
+      <w:numFmt w:val="bullet"/>
+      <w:lvlText w:val=""/>
+      <w:lvlJc w:val="left"/>
+      <w:pPr>
+        <w:tabs>
+          <w:tab w:val="num" w:pos="6480"/>
+        </w:tabs>
+        <w:ind w:left="6480" w:hanging="360"/>
+      </w:pPr>
+      <w:rPr>
+        <w:rFonts w:ascii="Wingdings" w:hAnsi="Wingdings" w:hint="default"/>
+        <w:sz w:val="20"/>
+      </w:rPr>
+    </w:lvl>
+  </w:abstractNum>
+  <w:abstractNum w:abstractNumId="2" w15:restartNumberingAfterBreak="0">
     <w:nsid w:val="22CE68E1"/>
     <w:multiLevelType w:val="multilevel"/>
     <w:tmpl w:val="91469468"/>
@@ -9856,7 +10386,7 @@
       </w:rPr>
     </w:lvl>
   </w:abstractNum>
-  <w:abstractNum w:abstractNumId="2" w15:restartNumberingAfterBreak="0">
+  <w:abstractNum w:abstractNumId="3" w15:restartNumberingAfterBreak="0">
     <w:nsid w:val="251F523E"/>
     <w:multiLevelType w:val="multilevel"/>
     <w:tmpl w:val="994C8806"/>
@@ -10005,7 +10535,7 @@
       </w:rPr>
     </w:lvl>
   </w:abstractNum>
-  <w:abstractNum w:abstractNumId="3" w15:restartNumberingAfterBreak="0">
+  <w:abstractNum w:abstractNumId="4" w15:restartNumberingAfterBreak="0">
     <w:nsid w:val="286A1738"/>
     <w:multiLevelType w:val="multilevel"/>
     <w:tmpl w:val="CF50BFA2"/>
@@ -10154,7 +10684,7 @@
       </w:rPr>
     </w:lvl>
   </w:abstractNum>
-  <w:abstractNum w:abstractNumId="4" w15:restartNumberingAfterBreak="0">
+  <w:abstractNum w:abstractNumId="5" w15:restartNumberingAfterBreak="0">
     <w:nsid w:val="2C811065"/>
     <w:multiLevelType w:val="multilevel"/>
     <w:tmpl w:val="4A589D7C"/>
@@ -10303,7 +10833,305 @@
       </w:rPr>
     </w:lvl>
   </w:abstractNum>
-  <w:abstractNum w:abstractNumId="5" w15:restartNumberingAfterBreak="0">
+  <w:abstractNum w:abstractNumId="6" w15:restartNumberingAfterBreak="0">
+    <w:nsid w:val="3B125F29"/>
+    <w:multiLevelType w:val="multilevel"/>
+    <w:tmpl w:val="D2A6E302"/>
+    <w:lvl w:ilvl="0">
+      <w:start w:val="1"/>
+      <w:numFmt w:val="bullet"/>
+      <w:lvlText w:val=""/>
+      <w:lvlJc w:val="left"/>
+      <w:pPr>
+        <w:tabs>
+          <w:tab w:val="num" w:pos="720"/>
+        </w:tabs>
+        <w:ind w:left="720" w:hanging="360"/>
+      </w:pPr>
+      <w:rPr>
+        <w:rFonts w:ascii="Symbol" w:hAnsi="Symbol" w:hint="default"/>
+        <w:sz w:val="20"/>
+      </w:rPr>
+    </w:lvl>
+    <w:lvl w:ilvl="1" w:tentative="1">
+      <w:start w:val="1"/>
+      <w:numFmt w:val="bullet"/>
+      <w:lvlText w:val="o"/>
+      <w:lvlJc w:val="left"/>
+      <w:pPr>
+        <w:tabs>
+          <w:tab w:val="num" w:pos="1440"/>
+        </w:tabs>
+        <w:ind w:left="1440" w:hanging="360"/>
+      </w:pPr>
+      <w:rPr>
+        <w:rFonts w:ascii="Courier New" w:hAnsi="Courier New" w:hint="default"/>
+        <w:sz w:val="20"/>
+      </w:rPr>
+    </w:lvl>
+    <w:lvl w:ilvl="2" w:tentative="1">
+      <w:start w:val="1"/>
+      <w:numFmt w:val="bullet"/>
+      <w:lvlText w:val=""/>
+      <w:lvlJc w:val="left"/>
+      <w:pPr>
+        <w:tabs>
+          <w:tab w:val="num" w:pos="2160"/>
+        </w:tabs>
+        <w:ind w:left="2160" w:hanging="360"/>
+      </w:pPr>
+      <w:rPr>
+        <w:rFonts w:ascii="Wingdings" w:hAnsi="Wingdings" w:hint="default"/>
+        <w:sz w:val="20"/>
+      </w:rPr>
+    </w:lvl>
+    <w:lvl w:ilvl="3" w:tentative="1">
+      <w:start w:val="1"/>
+      <w:numFmt w:val="bullet"/>
+      <w:lvlText w:val=""/>
+      <w:lvlJc w:val="left"/>
+      <w:pPr>
+        <w:tabs>
+          <w:tab w:val="num" w:pos="2880"/>
+        </w:tabs>
+        <w:ind w:left="2880" w:hanging="360"/>
+      </w:pPr>
+      <w:rPr>
+        <w:rFonts w:ascii="Wingdings" w:hAnsi="Wingdings" w:hint="default"/>
+        <w:sz w:val="20"/>
+      </w:rPr>
+    </w:lvl>
+    <w:lvl w:ilvl="4" w:tentative="1">
+      <w:start w:val="1"/>
+      <w:numFmt w:val="bullet"/>
+      <w:lvlText w:val=""/>
+      <w:lvlJc w:val="left"/>
+      <w:pPr>
+        <w:tabs>
+          <w:tab w:val="num" w:pos="3600"/>
+        </w:tabs>
+        <w:ind w:left="3600" w:hanging="360"/>
+      </w:pPr>
+      <w:rPr>
+        <w:rFonts w:ascii="Wingdings" w:hAnsi="Wingdings" w:hint="default"/>
+        <w:sz w:val="20"/>
+      </w:rPr>
+    </w:lvl>
+    <w:lvl w:ilvl="5" w:tentative="1">
+      <w:start w:val="1"/>
+      <w:numFmt w:val="bullet"/>
+      <w:lvlText w:val=""/>
+      <w:lvlJc w:val="left"/>
+      <w:pPr>
+        <w:tabs>
+          <w:tab w:val="num" w:pos="4320"/>
+        </w:tabs>
+        <w:ind w:left="4320" w:hanging="360"/>
+      </w:pPr>
+      <w:rPr>
+        <w:rFonts w:ascii="Wingdings" w:hAnsi="Wingdings" w:hint="default"/>
+        <w:sz w:val="20"/>
+      </w:rPr>
+    </w:lvl>
+    <w:lvl w:ilvl="6" w:tentative="1">
+      <w:start w:val="1"/>
+      <w:numFmt w:val="bullet"/>
+      <w:lvlText w:val=""/>
+      <w:lvlJc w:val="left"/>
+      <w:pPr>
+        <w:tabs>
+          <w:tab w:val="num" w:pos="5040"/>
+        </w:tabs>
+        <w:ind w:left="5040" w:hanging="360"/>
+      </w:pPr>
+      <w:rPr>
+        <w:rFonts w:ascii="Wingdings" w:hAnsi="Wingdings" w:hint="default"/>
+        <w:sz w:val="20"/>
+      </w:rPr>
+    </w:lvl>
+    <w:lvl w:ilvl="7" w:tentative="1">
+      <w:start w:val="1"/>
+      <w:numFmt w:val="bullet"/>
+      <w:lvlText w:val=""/>
+      <w:lvlJc w:val="left"/>
+      <w:pPr>
+        <w:tabs>
+          <w:tab w:val="num" w:pos="5760"/>
+        </w:tabs>
+        <w:ind w:left="5760" w:hanging="360"/>
+      </w:pPr>
+      <w:rPr>
+        <w:rFonts w:ascii="Wingdings" w:hAnsi="Wingdings" w:hint="default"/>
+        <w:sz w:val="20"/>
+      </w:rPr>
+    </w:lvl>
+    <w:lvl w:ilvl="8" w:tentative="1">
+      <w:start w:val="1"/>
+      <w:numFmt w:val="bullet"/>
+      <w:lvlText w:val=""/>
+      <w:lvlJc w:val="left"/>
+      <w:pPr>
+        <w:tabs>
+          <w:tab w:val="num" w:pos="6480"/>
+        </w:tabs>
+        <w:ind w:left="6480" w:hanging="360"/>
+      </w:pPr>
+      <w:rPr>
+        <w:rFonts w:ascii="Wingdings" w:hAnsi="Wingdings" w:hint="default"/>
+        <w:sz w:val="20"/>
+      </w:rPr>
+    </w:lvl>
+  </w:abstractNum>
+  <w:abstractNum w:abstractNumId="7" w15:restartNumberingAfterBreak="0">
+    <w:nsid w:val="402B7973"/>
+    <w:multiLevelType w:val="multilevel"/>
+    <w:tmpl w:val="FE128C96"/>
+    <w:lvl w:ilvl="0">
+      <w:start w:val="1"/>
+      <w:numFmt w:val="bullet"/>
+      <w:lvlText w:val=""/>
+      <w:lvlJc w:val="left"/>
+      <w:pPr>
+        <w:tabs>
+          <w:tab w:val="num" w:pos="720"/>
+        </w:tabs>
+        <w:ind w:left="720" w:hanging="360"/>
+      </w:pPr>
+      <w:rPr>
+        <w:rFonts w:ascii="Symbol" w:hAnsi="Symbol" w:hint="default"/>
+        <w:sz w:val="20"/>
+      </w:rPr>
+    </w:lvl>
+    <w:lvl w:ilvl="1" w:tentative="1">
+      <w:start w:val="1"/>
+      <w:numFmt w:val="bullet"/>
+      <w:lvlText w:val="o"/>
+      <w:lvlJc w:val="left"/>
+      <w:pPr>
+        <w:tabs>
+          <w:tab w:val="num" w:pos="1440"/>
+        </w:tabs>
+        <w:ind w:left="1440" w:hanging="360"/>
+      </w:pPr>
+      <w:rPr>
+        <w:rFonts w:ascii="Courier New" w:hAnsi="Courier New" w:hint="default"/>
+        <w:sz w:val="20"/>
+      </w:rPr>
+    </w:lvl>
+    <w:lvl w:ilvl="2" w:tentative="1">
+      <w:start w:val="1"/>
+      <w:numFmt w:val="bullet"/>
+      <w:lvlText w:val=""/>
+      <w:lvlJc w:val="left"/>
+      <w:pPr>
+        <w:tabs>
+          <w:tab w:val="num" w:pos="2160"/>
+        </w:tabs>
+        <w:ind w:left="2160" w:hanging="360"/>
+      </w:pPr>
+      <w:rPr>
+        <w:rFonts w:ascii="Wingdings" w:hAnsi="Wingdings" w:hint="default"/>
+        <w:sz w:val="20"/>
+      </w:rPr>
+    </w:lvl>
+    <w:lvl w:ilvl="3" w:tentative="1">
+      <w:start w:val="1"/>
+      <w:numFmt w:val="bullet"/>
+      <w:lvlText w:val=""/>
+      <w:lvlJc w:val="left"/>
+      <w:pPr>
+        <w:tabs>
+          <w:tab w:val="num" w:pos="2880"/>
+        </w:tabs>
+        <w:ind w:left="2880" w:hanging="360"/>
+      </w:pPr>
+      <w:rPr>
+        <w:rFonts w:ascii="Wingdings" w:hAnsi="Wingdings" w:hint="default"/>
+        <w:sz w:val="20"/>
+      </w:rPr>
+    </w:lvl>
+    <w:lvl w:ilvl="4" w:tentative="1">
+      <w:start w:val="1"/>
+      <w:numFmt w:val="bullet"/>
+      <w:lvlText w:val=""/>
+      <w:lvlJc w:val="left"/>
+      <w:pPr>
+        <w:tabs>
+          <w:tab w:val="num" w:pos="3600"/>
+        </w:tabs>
+        <w:ind w:left="3600" w:hanging="360"/>
+      </w:pPr>
+      <w:rPr>
+        <w:rFonts w:ascii="Wingdings" w:hAnsi="Wingdings" w:hint="default"/>
+        <w:sz w:val="20"/>
+      </w:rPr>
+    </w:lvl>
+    <w:lvl w:ilvl="5" w:tentative="1">
+      <w:start w:val="1"/>
+      <w:numFmt w:val="bullet"/>
+      <w:lvlText w:val=""/>
+      <w:lvlJc w:val="left"/>
+      <w:pPr>
+        <w:tabs>
+          <w:tab w:val="num" w:pos="4320"/>
+        </w:tabs>
+        <w:ind w:left="4320" w:hanging="360"/>
+      </w:pPr>
+      <w:rPr>
+        <w:rFonts w:ascii="Wingdings" w:hAnsi="Wingdings" w:hint="default"/>
+        <w:sz w:val="20"/>
+      </w:rPr>
+    </w:lvl>
+    <w:lvl w:ilvl="6" w:tentative="1">
+      <w:start w:val="1"/>
+      <w:numFmt w:val="bullet"/>
+      <w:lvlText w:val=""/>
+      <w:lvlJc w:val="left"/>
+      <w:pPr>
+        <w:tabs>
+          <w:tab w:val="num" w:pos="5040"/>
+        </w:tabs>
+        <w:ind w:left="5040" w:hanging="360"/>
+      </w:pPr>
+      <w:rPr>
+        <w:rFonts w:ascii="Wingdings" w:hAnsi="Wingdings" w:hint="default"/>
+        <w:sz w:val="20"/>
+      </w:rPr>
+    </w:lvl>
+    <w:lvl w:ilvl="7" w:tentative="1">
+      <w:start w:val="1"/>
+      <w:numFmt w:val="bullet"/>
+      <w:lvlText w:val=""/>
+      <w:lvlJc w:val="left"/>
+      <w:pPr>
+        <w:tabs>
+          <w:tab w:val="num" w:pos="5760"/>
+        </w:tabs>
+        <w:ind w:left="5760" w:hanging="360"/>
+      </w:pPr>
+      <w:rPr>
+        <w:rFonts w:ascii="Wingdings" w:hAnsi="Wingdings" w:hint="default"/>
+        <w:sz w:val="20"/>
+      </w:rPr>
+    </w:lvl>
+    <w:lvl w:ilvl="8" w:tentative="1">
+      <w:start w:val="1"/>
+      <w:numFmt w:val="bullet"/>
+      <w:lvlText w:val=""/>
+      <w:lvlJc w:val="left"/>
+      <w:pPr>
+        <w:tabs>
+          <w:tab w:val="num" w:pos="6480"/>
+        </w:tabs>
+        <w:ind w:left="6480" w:hanging="360"/>
+      </w:pPr>
+      <w:rPr>
+        <w:rFonts w:ascii="Wingdings" w:hAnsi="Wingdings" w:hint="default"/>
+        <w:sz w:val="20"/>
+      </w:rPr>
+    </w:lvl>
+  </w:abstractNum>
+  <w:abstractNum w:abstractNumId="8" w15:restartNumberingAfterBreak="0">
     <w:nsid w:val="4D2677F6"/>
     <w:multiLevelType w:val="hybridMultilevel"/>
     <w:tmpl w:val="F3D0FD02"/>
@@ -10416,7 +11244,120 @@
       </w:rPr>
     </w:lvl>
   </w:abstractNum>
-  <w:abstractNum w:abstractNumId="6" w15:restartNumberingAfterBreak="0">
+  <w:abstractNum w:abstractNumId="9" w15:restartNumberingAfterBreak="0">
+    <w:nsid w:val="4DD53A55"/>
+    <w:multiLevelType w:val="hybridMultilevel"/>
+    <w:tmpl w:val="0988E5DE"/>
+    <w:lvl w:ilvl="0" w:tplc="540A0001">
+      <w:start w:val="1"/>
+      <w:numFmt w:val="bullet"/>
+      <w:lvlText w:val=""/>
+      <w:lvlJc w:val="left"/>
+      <w:pPr>
+        <w:ind w:left="720" w:hanging="360"/>
+      </w:pPr>
+      <w:rPr>
+        <w:rFonts w:ascii="Symbol" w:hAnsi="Symbol" w:hint="default"/>
+      </w:rPr>
+    </w:lvl>
+    <w:lvl w:ilvl="1" w:tplc="540A0003" w:tentative="1">
+      <w:start w:val="1"/>
+      <w:numFmt w:val="bullet"/>
+      <w:lvlText w:val="o"/>
+      <w:lvlJc w:val="left"/>
+      <w:pPr>
+        <w:ind w:left="1440" w:hanging="360"/>
+      </w:pPr>
+      <w:rPr>
+        <w:rFonts w:ascii="Courier New" w:hAnsi="Courier New" w:cs="Courier New" w:hint="default"/>
+      </w:rPr>
+    </w:lvl>
+    <w:lvl w:ilvl="2" w:tplc="540A0005" w:tentative="1">
+      <w:start w:val="1"/>
+      <w:numFmt w:val="bullet"/>
+      <w:lvlText w:val=""/>
+      <w:lvlJc w:val="left"/>
+      <w:pPr>
+        <w:ind w:left="2160" w:hanging="360"/>
+      </w:pPr>
+      <w:rPr>
+        <w:rFonts w:ascii="Wingdings" w:hAnsi="Wingdings" w:hint="default"/>
+      </w:rPr>
+    </w:lvl>
+    <w:lvl w:ilvl="3" w:tplc="540A0001" w:tentative="1">
+      <w:start w:val="1"/>
+      <w:numFmt w:val="bullet"/>
+      <w:lvlText w:val=""/>
+      <w:lvlJc w:val="left"/>
+      <w:pPr>
+        <w:ind w:left="2880" w:hanging="360"/>
+      </w:pPr>
+      <w:rPr>
+        <w:rFonts w:ascii="Symbol" w:hAnsi="Symbol" w:hint="default"/>
+      </w:rPr>
+    </w:lvl>
+    <w:lvl w:ilvl="4" w:tplc="540A0003" w:tentative="1">
+      <w:start w:val="1"/>
+      <w:numFmt w:val="bullet"/>
+      <w:lvlText w:val="o"/>
+      <w:lvlJc w:val="left"/>
+      <w:pPr>
+        <w:ind w:left="3600" w:hanging="360"/>
+      </w:pPr>
+      <w:rPr>
+        <w:rFonts w:ascii="Courier New" w:hAnsi="Courier New" w:cs="Courier New" w:hint="default"/>
+      </w:rPr>
+    </w:lvl>
+    <w:lvl w:ilvl="5" w:tplc="540A0005" w:tentative="1">
+      <w:start w:val="1"/>
+      <w:numFmt w:val="bullet"/>
+      <w:lvlText w:val=""/>
+      <w:lvlJc w:val="left"/>
+      <w:pPr>
+        <w:ind w:left="4320" w:hanging="360"/>
+      </w:pPr>
+      <w:rPr>
+        <w:rFonts w:ascii="Wingdings" w:hAnsi="Wingdings" w:hint="default"/>
+      </w:rPr>
+    </w:lvl>
+    <w:lvl w:ilvl="6" w:tplc="540A0001" w:tentative="1">
+      <w:start w:val="1"/>
+      <w:numFmt w:val="bullet"/>
+      <w:lvlText w:val=""/>
+      <w:lvlJc w:val="left"/>
+      <w:pPr>
+        <w:ind w:left="5040" w:hanging="360"/>
+      </w:pPr>
+      <w:rPr>
+        <w:rFonts w:ascii="Symbol" w:hAnsi="Symbol" w:hint="default"/>
+      </w:rPr>
+    </w:lvl>
+    <w:lvl w:ilvl="7" w:tplc="540A0003" w:tentative="1">
+      <w:start w:val="1"/>
+      <w:numFmt w:val="bullet"/>
+      <w:lvlText w:val="o"/>
+      <w:lvlJc w:val="left"/>
+      <w:pPr>
+        <w:ind w:left="5760" w:hanging="360"/>
+      </w:pPr>
+      <w:rPr>
+        <w:rFonts w:ascii="Courier New" w:hAnsi="Courier New" w:cs="Courier New" w:hint="default"/>
+      </w:rPr>
+    </w:lvl>
+    <w:lvl w:ilvl="8" w:tplc="540A0005" w:tentative="1">
+      <w:start w:val="1"/>
+      <w:numFmt w:val="bullet"/>
+      <w:lvlText w:val=""/>
+      <w:lvlJc w:val="left"/>
+      <w:pPr>
+        <w:ind w:left="6480" w:hanging="360"/>
+      </w:pPr>
+      <w:rPr>
+        <w:rFonts w:ascii="Wingdings" w:hAnsi="Wingdings" w:hint="default"/>
+      </w:rPr>
+    </w:lvl>
+  </w:abstractNum>
+  <w:abstractNum w:abstractNumId="10" w15:restartNumberingAfterBreak="0">
     <w:nsid w:val="5C781F70"/>
     <w:multiLevelType w:val="multilevel"/>
     <w:tmpl w:val="8B9EBAFC"/>
@@ -10565,7 +11506,7 @@
       </w:rPr>
     </w:lvl>
   </w:abstractNum>
-  <w:abstractNum w:abstractNumId="7" w15:restartNumberingAfterBreak="0">
+  <w:abstractNum w:abstractNumId="11" w15:restartNumberingAfterBreak="0">
     <w:nsid w:val="61A12A72"/>
     <w:multiLevelType w:val="multilevel"/>
     <w:tmpl w:val="385214F0"/>
@@ -10714,7 +11655,7 @@
       </w:rPr>
     </w:lvl>
   </w:abstractNum>
-  <w:abstractNum w:abstractNumId="8" w15:restartNumberingAfterBreak="0">
+  <w:abstractNum w:abstractNumId="12" w15:restartNumberingAfterBreak="0">
     <w:nsid w:val="6F2B04AE"/>
     <w:multiLevelType w:val="multilevel"/>
     <w:tmpl w:val="6576D2C4"/>
@@ -10863,7 +11804,7 @@
       </w:rPr>
     </w:lvl>
   </w:abstractNum>
-  <w:abstractNum w:abstractNumId="9" w15:restartNumberingAfterBreak="0">
+  <w:abstractNum w:abstractNumId="13" w15:restartNumberingAfterBreak="0">
     <w:nsid w:val="72515A6D"/>
     <w:multiLevelType w:val="multilevel"/>
     <w:tmpl w:val="B73C0EA2"/>
@@ -11012,7 +11953,7 @@
       </w:rPr>
     </w:lvl>
   </w:abstractNum>
-  <w:abstractNum w:abstractNumId="10" w15:restartNumberingAfterBreak="0">
+  <w:abstractNum w:abstractNumId="14" w15:restartNumberingAfterBreak="0">
     <w:nsid w:val="72EF7CDE"/>
     <w:multiLevelType w:val="hybridMultilevel"/>
     <w:tmpl w:val="3F700920"/>
@@ -11125,7 +12066,7 @@
       </w:rPr>
     </w:lvl>
   </w:abstractNum>
-  <w:abstractNum w:abstractNumId="11" w15:restartNumberingAfterBreak="0">
+  <w:abstractNum w:abstractNumId="15" w15:restartNumberingAfterBreak="0">
     <w:nsid w:val="7861684A"/>
     <w:multiLevelType w:val="multilevel"/>
     <w:tmpl w:val="6666D426"/>
@@ -11274,7 +12215,7 @@
       </w:rPr>
     </w:lvl>
   </w:abstractNum>
-  <w:abstractNum w:abstractNumId="12" w15:restartNumberingAfterBreak="0">
+  <w:abstractNum w:abstractNumId="16" w15:restartNumberingAfterBreak="0">
     <w:nsid w:val="787564BB"/>
     <w:multiLevelType w:val="multilevel"/>
     <w:tmpl w:val="647AF9F2"/>
@@ -11423,7 +12364,7 @@
       </w:rPr>
     </w:lvl>
   </w:abstractNum>
-  <w:abstractNum w:abstractNumId="13" w15:restartNumberingAfterBreak="0">
+  <w:abstractNum w:abstractNumId="17" w15:restartNumberingAfterBreak="0">
     <w:nsid w:val="7C215553"/>
     <w:multiLevelType w:val="hybridMultilevel"/>
     <w:tmpl w:val="450407A4"/>
@@ -11537,52 +12478,64 @@
     </w:lvl>
   </w:abstractNum>
   <w:num w:numId="1">
-    <w:abstractNumId w:val="5"/>
+    <w:abstractNumId w:val="8"/>
   </w:num>
   <w:num w:numId="2">
+    <w:abstractNumId w:val="3"/>
+  </w:num>
+  <w:num w:numId="3">
+    <w:abstractNumId w:val="12"/>
+  </w:num>
+  <w:num w:numId="4">
+    <w:abstractNumId w:val="15"/>
+  </w:num>
+  <w:num w:numId="5">
+    <w:abstractNumId w:val="16"/>
+  </w:num>
+  <w:num w:numId="6">
+    <w:abstractNumId w:val="4"/>
+  </w:num>
+  <w:num w:numId="7">
+    <w:abstractNumId w:val="17"/>
+  </w:num>
+  <w:num w:numId="8">
+    <w:abstractNumId w:val="14"/>
+  </w:num>
+  <w:num w:numId="9">
     <w:abstractNumId w:val="2"/>
   </w:num>
-  <w:num w:numId="3">
-    <w:abstractNumId w:val="8"/>
-  </w:num>
-  <w:num w:numId="4">
-    <w:abstractNumId w:val="11"/>
-  </w:num>
-  <w:num w:numId="5">
-    <w:abstractNumId w:val="12"/>
-  </w:num>
-  <w:num w:numId="6">
-    <w:abstractNumId w:val="3"/>
-  </w:num>
-  <w:num w:numId="7">
+  <w:num w:numId="10">
     <w:abstractNumId w:val="13"/>
   </w:num>
-  <w:num w:numId="8">
+  <w:num w:numId="11">
     <w:abstractNumId w:val="10"/>
-  </w:num>
-  <w:num w:numId="9">
-    <w:abstractNumId w:val="1"/>
-  </w:num>
-  <w:num w:numId="10">
-    <w:abstractNumId w:val="9"/>
-  </w:num>
-  <w:num w:numId="11">
-    <w:abstractNumId w:val="6"/>
   </w:num>
   <w:num w:numId="12">
     <w:abstractNumId w:val="0"/>
   </w:num>
   <w:num w:numId="13">
-    <w:abstractNumId w:val="4"/>
+    <w:abstractNumId w:val="5"/>
   </w:num>
   <w:num w:numId="14">
+    <w:abstractNumId w:val="11"/>
+  </w:num>
+  <w:num w:numId="15">
+    <w:abstractNumId w:val="1"/>
+  </w:num>
+  <w:num w:numId="16">
+    <w:abstractNumId w:val="6"/>
+  </w:num>
+  <w:num w:numId="17">
+    <w:abstractNumId w:val="9"/>
+  </w:num>
+  <w:num w:numId="18">
     <w:abstractNumId w:val="7"/>
   </w:num>
 </w:numbering>
 </file>
 
 <file path=word/styles.xml><?xml version="1.0" encoding="utf-8"?>
-<w:styles xmlns:mc="http://schemas.openxmlformats.org/markup-compatibility/2006" xmlns:r="http://schemas.openxmlformats.org/officeDocument/2006/relationships" xmlns:w="http://schemas.openxmlformats.org/wordprocessingml/2006/main" xmlns:w14="http://schemas.microsoft.com/office/word/2010/wordml" xmlns:w15="http://schemas.microsoft.com/office/word/2012/wordml" xmlns:w16cex="http://schemas.microsoft.com/office/word/2018/wordml/cex" xmlns:w16cid="http://schemas.microsoft.com/office/word/2016/wordml/cid" xmlns:w16="http://schemas.microsoft.com/office/word/2018/wordml" xmlns:w16sdtdh="http://schemas.microsoft.com/office/word/2020/wordml/sdtdatahash" xmlns:w16se="http://schemas.microsoft.com/office/word/2015/wordml/symex" mc:Ignorable="w14 w15 w16se w16cid w16 w16cex w16sdtdh">
+<w:styles xmlns:mc="http://schemas.openxmlformats.org/markup-compatibility/2006" xmlns:r="http://schemas.openxmlformats.org/officeDocument/2006/relationships" xmlns:w="http://schemas.openxmlformats.org/wordprocessingml/2006/main" xmlns:w14="http://schemas.microsoft.com/office/word/2010/wordml" xmlns:w15="http://schemas.microsoft.com/office/word/2012/wordml" xmlns:w16se="http://schemas.microsoft.com/office/word/2015/wordml/symex" mc:Ignorable="w14 w15 w16se">
   <w:docDefaults>
     <w:rPrDefault>
       <w:rPr>
@@ -11600,7 +12553,7 @@
       </w:pPr>
     </w:pPrDefault>
   </w:docDefaults>
-  <w:latentStyles w:defLockedState="0" w:defUIPriority="99" w:defSemiHidden="0" w:defUnhideWhenUsed="0" w:defQFormat="0" w:count="376">
+  <w:latentStyles w:defLockedState="0" w:defUIPriority="99" w:defSemiHidden="0" w:defUnhideWhenUsed="0" w:defQFormat="0" w:count="371">
     <w:lsdException w:name="Normal" w:uiPriority="0" w:qFormat="1"/>
     <w:lsdException w:name="heading 1" w:uiPriority="9" w:qFormat="1"/>
     <w:lsdException w:name="heading 2" w:semiHidden="1" w:uiPriority="9" w:unhideWhenUsed="1" w:qFormat="1"/>
@@ -11972,11 +12925,6 @@
     <w:lsdException w:name="List Table 5 Dark Accent 6" w:uiPriority="50"/>
     <w:lsdException w:name="List Table 6 Colorful Accent 6" w:uiPriority="51"/>
     <w:lsdException w:name="List Table 7 Colorful Accent 6" w:uiPriority="52"/>
-    <w:lsdException w:name="Mention" w:semiHidden="1" w:unhideWhenUsed="1"/>
-    <w:lsdException w:name="Smart Hyperlink" w:semiHidden="1" w:unhideWhenUsed="1"/>
-    <w:lsdException w:name="Hashtag" w:semiHidden="1" w:unhideWhenUsed="1"/>
-    <w:lsdException w:name="Unresolved Mention" w:semiHidden="1" w:unhideWhenUsed="1"/>
-    <w:lsdException w:name="Smart Link" w:semiHidden="1" w:unhideWhenUsed="1"/>
   </w:latentStyles>
   <w:style w:type="paragraph" w:default="1" w:styleId="Normal">
     <w:name w:val="Normal"/>

</xml_diff>